<commit_message>
docs(cadrage): corrige l'incoherence persona Lucas vs Lea/Karim
La Customer Journey Map prenait "Lucas Moreau" comme persona de reference
alors qu'il etait absent des Personas (qui ne decrivaient que Lea, Karim,
Sophie). Ajout de Lucas comme persona primaire #1 dans les Personas,
coherent avec le parcours detaille du Customer Journey (L3 Info, Reseaux).

- personas.md: ajout du persona Lucas Moreau (#1), renumerotation des
  sections, ajout dans la synthese de priorisation, version v1.2.
- 03_customer_journey_map.md: lien vers le persona dans les Personas.
- generate.py: sortie personas v1.1 -> v1.2; regeneration des .docx,
  suppression de l'ancien equipe-6-personas-v1.1.docx.

Co-Authored-By: Claude Opus 4.8 <noreply@anthropic.com>
</commit_message>
<xml_diff>
--- a/docs/cadrage/equipe-6-customer-journey-map-v1.0.docx
+++ b/docs/cadrage/equipe-6-customer-journey-map-v1.0.docx
@@ -372,6 +372,14 @@
       </w:pPr>
       <w:r>
         <w:t>Persona de référence — Lucas Moreau (cible primaire imposée)</w:t>
+      </w:r>
+    </w:p>
+    <w:p>
+      <w:pPr>
+        <w:ind w:left="454"/>
+      </w:pPr>
+      <w:r>
+        <w:t>Persona décrit dans les Personas — §2, Persona primaire #1.</w:t>
       </w:r>
     </w:p>
     <w:p>

</xml_diff>